<commit_message>
Redact current-setup security detail from requirements doc
Describe the credential and privilege problems without listing tokens or container flags, and drop host names from the hosting question.

Signed-off-by: Noah White <noah@noahwhite.net>
</commit_message>
<xml_diff>
--- a/docs/requirements.docx
+++ b/docs/requirements.docx
@@ -204,7 +204,7 @@
               <w:pStyle w:val="Compact"/>
             </w:pPr>
             <w:r>
-              <w:t xml:space="preserve">Every token (GitHub x2, Linear x2, Grafana x2, PagerDuty, BWS, Tailscale, Kimi, DeepSeek) is injected into every container as env vars, whatever the task</w:t>
+              <w:t xml:space="preserve">Every long-lived credential is available to every session as env vars, whatever the task</w:t>
             </w:r>
           </w:p>
         </w:tc>
@@ -228,37 +228,7 @@
               <w:pStyle w:val="Compact"/>
             </w:pPr>
             <w:r>
-              <w:rPr>
-                <w:rStyle w:val="VerbatimChar"/>
-              </w:rPr>
-              <w:t xml:space="preserve">/var/run/docker.sock</w:t>
-            </w:r>
-            <w:r>
-              <w:t xml:space="preserve"> </w:t>
-            </w:r>
-            <w:r>
-              <w:t xml:space="preserve">mounted,</w:t>
-            </w:r>
-            <w:r>
-              <w:t xml:space="preserve"> </w:t>
-            </w:r>
-            <w:r>
-              <w:rPr>
-                <w:rStyle w:val="VerbatimChar"/>
-              </w:rPr>
-              <w:t xml:space="preserve">NET_ADMIN</w:t>
-            </w:r>
-            <w:r>
-              <w:t xml:space="preserve">,</w:t>
-            </w:r>
-            <w:r>
-              <w:t xml:space="preserve"> </w:t>
-            </w:r>
-            <w:r>
-              <w:rPr>
-                <w:rStyle w:val="VerbatimChar"/>
-              </w:rPr>
-              <w:t xml:space="preserve">seccomp:unconfined</w:t>
+              <w:t xml:space="preserve">Containers run with host-level privileges</w:t>
             </w:r>
           </w:p>
         </w:tc>
@@ -7099,7 +7069,7 @@
         </w:numPr>
       </w:pPr>
       <w:r>
-        <w:t xml:space="preserve">Which host runs it: the existing CI/CD runner host, a new Hetzner box, or blackstar hardware at home?</w:t>
+        <w:t xml:space="preserve">Which host runs it?</w:t>
       </w:r>
     </w:p>
     <w:p>

</xml_diff>

<commit_message>
Address review findings in requirements doc
- GH-6: restrict linked-user tokens to the session's target repo; route
  actions outside the persona's permissions through the broker
- COST-3: record subscription refresh credentials as an ID-2 exception
  until Phase 0 proves broker-held credentials
- COST-1: subscription spend is a notional API-equivalent figure
- SB-1: microVM or gVisor-sandboxed container
- MoSCoW legend maps priorities to phases; KN-1 into Phase 1, SEC-6 into
  Phase 2
- SWE-2: current list price and promotional terms

Signed-off-by: Noah White <noah@noahwhite.net>
</commit_message>
<xml_diff>
--- a/docs/requirements.docx
+++ b/docs/requirements.docx
@@ -569,7 +569,7 @@
         </w:numPr>
       </w:pPr>
       <w:r>
-        <w:t xml:space="preserve">Zero long-lived credentials inside a sandbox: every secret short-lived and scoped to the session.</w:t>
+        <w:t xml:space="preserve">Zero long-lived credentials inside a sandbox: every secret short-lived and scoped to the session (subscription logins excepted until resolved, see COST-3).</w:t>
       </w:r>
     </w:p>
     <w:p>
@@ -1517,7 +1517,7 @@
               <w:pStyle w:val="Compact"/>
             </w:pPr>
             <w:r>
-              <w:t xml:space="preserve">$0.75 input / $3.75 output per 1M tokens; Devin credit multiplier 6 / 9 / 12 by effort</w:t>
+              <w:t xml:space="preserve">$3 input / $15 output per 1M tokens list price (free on self-serve plans through Oct 15, 2026; $0.75 / $3.75 for credit-based enterprise customers through Dec 31, 2026); Devin credit multiplier 6 / 9 / 12 by effort</w:t>
             </w:r>
           </w:p>
         </w:tc>
@@ -2454,7 +2454,7 @@
         <w:pStyle w:val="FirstParagraph"/>
       </w:pPr>
       <w:r>
-        <w:t xml:space="preserve">Priorities use MoSCoW: M = MVP, S = phase 2, C = later, W = won't do. Each ID is meant to become one or more OFF stories.</w:t>
+        <w:t xml:space="preserve">Priorities use MoSCoW: M = must (Phase 1 or 2), S = should (Phase 2 to 4), C = could (Phase 4 or later), W = won't do. Each ID is meant to become one or more OFF stories.</w:t>
       </w:r>
     </w:p>
     <w:bookmarkStart w:id="37" w:name="sessions-and-sandboxes"/>
@@ -2534,7 +2534,7 @@
               <w:pStyle w:val="Compact"/>
             </w:pPr>
             <w:r>
-              <w:t xml:space="preserve">Each session runs in its own sandbox (microVM or rootless container) booted from a prebuilt snapshot in under 30 s</w:t>
+              <w:t xml:space="preserve">Each session runs in its own sandbox (microVM or gVisor-sandboxed container) booted from a prebuilt snapshot in under 30 s</w:t>
             </w:r>
           </w:p>
         </w:tc>
@@ -3824,7 +3824,7 @@
               <w:pStyle w:val="Compact"/>
             </w:pPr>
             <w:r>
-              <w:t xml:space="preserve">Users link their GitHub account through the app's user authorization (OAuth); the broker holds the refresh token and the sandbox gets only a short-lived user access token, which GitHub limits to the intersection of app permissions and the user's own access</w:t>
+              <w:t xml:space="preserve">Users link their GitHub account through the app's user authorization (OAuth); the broker holds the refresh token and the sandbox gets only a short-lived user access token restricted to the session's target repo (GitHub's repository_id parameter); user tokens cannot be narrowed to the persona's permissions, so any action outside them goes through the broker</w:t>
             </w:r>
           </w:p>
         </w:tc>
@@ -4937,7 +4937,7 @@
         <w:pStyle w:val="FirstParagraph"/>
       </w:pPr>
       <w:r>
-        <w:t xml:space="preserve">Security is the main reason to move off the current containers, so these are all MVP unless marked.</w:t>
+        <w:t xml:space="preserve">Security is the main reason to move off the current containers, so these are all M unless marked.</w:t>
       </w:r>
     </w:p>
     <w:bookmarkStart w:id="45" w:name="security-and-isolation"/>
@@ -5604,7 +5604,7 @@
               <w:pStyle w:val="Compact"/>
             </w:pPr>
             <w:r>
-              <w:t xml:space="preserve">Live spend per session from runtime events (tokens x model price), aggregated per issue, persona and day</w:t>
+              <w:t xml:space="preserve">Live spend per session from runtime events (tokens x model price), aggregated per issue, persona and day; for subscription runtimes this is a notional API-equivalent figure, and the provider's usage-limit windows are tracked separately</w:t>
             </w:r>
           </w:p>
         </w:tc>
@@ -5674,7 +5674,7 @@
               <w:pStyle w:val="Compact"/>
             </w:pPr>
             <w:r>
-              <w:t xml:space="preserve">Support subscription-auth runtimes (Claude Code OAuth, Codex login) alongside API keys, with per-session isolated auth homes</w:t>
+              <w:t xml:space="preserve">Support subscription-auth runtimes (Claude Code OAuth, Codex login) alongside API keys, with per-session isolated auth homes; these logins keep a refresh credential in that home, an exception to ID-2 until Phase 0 shows the broker can hold it and pass only access tokens to the sandbox</w:t>
             </w:r>
           </w:p>
         </w:tc>
@@ -6262,7 +6262,7 @@
         <w:pStyle w:val="FirstParagraph"/>
       </w:pPr>
       <w:r>
-        <w:t xml:space="preserve">A thin control plane schedules sandboxes and runs workflows; secrets, egress and images are handled by services outside the sandbox, so a compromised agent holds nothing long-lived.</w:t>
+        <w:t xml:space="preserve">A thin control plane schedules sandboxes and runs workflows; secrets, egress and images are handled by services outside the sandbox, so a compromised agent holds nothing long-lived (except a subscription login, see COST-3).</w:t>
       </w:r>
     </w:p>
     <w:p>
@@ -6935,7 +6935,7 @@
         <w:t xml:space="preserve"> </w:t>
       </w:r>
       <w:r>
-        <w:t xml:space="preserve">compare OpenHands runtime, Coder, E2B/microsandbox and plain Firecracker for SB-1, SEC-1, SEC-2; run one Claude Code session headless end to end. Exit: sandbox backend chosen, ADR merged.</w:t>
+        <w:t xml:space="preserve">compare OpenHands runtime, Coder, E2B/microsandbox and plain Firecracker for SB-1, SEC-1, SEC-2; test broker-held subscription credentials (COST-3); run one Claude Code session headless end to end. Exit: sandbox backend chosen, ADR merged.</w:t>
       </w:r>
     </w:p>
     <w:p>
@@ -6957,7 +6957,7 @@
         <w:t xml:space="preserve"> </w:t>
       </w:r>
       <w:r>
-        <w:t xml:space="preserve">SB-1..6, RT-1..4, RT-6, IN-3, IN-4, GH-1..3, GH-5..8, UX-1..5, SEC-1..5, SEC-7, ID-1..4, COST-1..4, OBS-1..3, OSS-1..4, OSS-6. Exit: one Officina story implemented through PR from the web UI with no terminal container.</w:t>
+        <w:t xml:space="preserve">SB-1..6, RT-1..4, RT-6, IN-3, IN-4, GH-1..3, GH-5..8, UX-1..5, SEC-1..5, SEC-7, ID-1..4, KN-1, COST-1..4, OBS-1..3, OSS-1..4, OSS-6. Exit: one Officina story implemented through PR from the web UI with no terminal container.</w:t>
       </w:r>
     </w:p>
     <w:p>
@@ -6979,7 +6979,7 @@
         <w:t xml:space="preserve"> </w:t>
       </w:r>
       <w:r>
-        <w:t xml:space="preserve">IN-1, IN-2, GH-4, IN-5, UX-6..8, WF-1..7. Exit: assigning an OFF story runs the full reference workflow to a merge-approval request; reviewers run read-only.</w:t>
+        <w:t xml:space="preserve">IN-1, IN-2, GH-4, IN-5, UX-6..8, WF-1..7, SEC-6. Exit: assigning an OFF story runs the full reference workflow to a merge-approval request; reviewers run read-only.</w:t>
       </w:r>
     </w:p>
     <w:p>
@@ -7001,7 +7001,7 @@
         <w:t xml:space="preserve"> </w:t>
       </w:r>
       <w:r>
-        <w:t xml:space="preserve">IN-6..8, SB-7, RT-5, KN-2, KN-4, ID-5, GH-9, COST-5, OBS-4, SEC-6. Exit: terminal containers retired; QA and PagerDuty sessions start without a human.</w:t>
+        <w:t xml:space="preserve">IN-6..8, SB-7, RT-5, KN-2, KN-4, ID-5, GH-9, COST-5, OBS-4. Exit: terminal containers retired; QA and PagerDuty sessions start without a human.</w:t>
       </w:r>
     </w:p>
     <w:p>

</xml_diff>

<commit_message>
docs: address round-1 review of requirements alignment
Align SB-1, SEC-1, SEC-5, GH-6, ID-1, ID-4, COST-1..3 and RT-3 with
the milestone-1 ADRs, replace rejected components in the reuse table,
narrow the Phase 0 spike, and resolve the build-vs-reuse and
subscription-terms open questions (owner sign-off split out).
Exported from the live doc at rev 73.
</commit_message>
<xml_diff>
--- a/docs/requirements.docx
+++ b/docs/requirements.docx
@@ -2389,7 +2389,7 @@
           <w:p>
             <w:pPr/>
             <w:r>
-              <w:t xml:space="preserve">Each session runs in its own sandbox (microVM or gVisor-sandboxed container) booted from a prebuilt snapshot in under 30 s</w:t>
+              <w:t xml:space="preserve">Each session runs in its own microVM sandbox (SEC-1) booted from a prebuilt snapshot in under 30 s</w:t>
             </w:r>
           </w:p>
         </w:tc>
@@ -2872,7 +2872,7 @@
           <w:p>
             <w:pPr/>
             <w:r>
-              <w:t xml:space="preserve">Per-session model and effort choice, with org defaults and a deny list (e.g. never Fable 5)</w:t>
+              <w:t xml:space="preserve">Per-session model and effort choice, with org defaults and a deny list (e.g. never Fable 5), enforced at the model gateway for API-key sessions and only by the runtime adapter in subscription mode (ADR-0014)</w:t>
             </w:r>
           </w:p>
         </w:tc>
@@ -3653,7 +3653,7 @@
           <w:p>
             <w:pPr/>
             <w:r>
-              <w:t xml:space="preserve">Users link their GitHub account through the app's user authorization (OAuth); the broker holds the refresh token and the sandbox gets only a short-lived user access token restricted to the session's target repo (GitHub's repository_id parameter); user tokens cannot be narrowed to the persona's permissions, so any action outside them goes through the broker</w:t>
+              <w:t xml:space="preserve">Users link their GitHub account through the app's user authorization (OAuth); the server keeps the refresh token in the secret store, and short-lived user access tokens are applied only at the worker, never inside the sandbox (ID-2); user tokens cannot be narrowed to the persona's permissions, so every use passes the persona's policy check (SEC-5); tokens are requested restricted to the session's target repo (GitHub's repository_id parameter) where GitHub allows it, as defense in depth only (ADR-0012)</w:t>
             </w:r>
           </w:p>
         </w:tc>
@@ -4835,7 +4835,7 @@
           <w:p>
             <w:pPr/>
             <w:r>
-              <w:t xml:space="preserve">Sandboxes get a VM-grade boundary (Firecracker, Cloud Hypervisor or gVisor); no host Docker socket, no </w:t>
+              <w:t xml:space="preserve">Sandboxes get a VM-grade boundary: a hardware-virtualized microVM such as Firecracker or Cloud Hypervisor; containers and userspace kernels such as gVisor do not qualify; no host Docker socket, no </w:t>
             </w:r>
             <w:r>
               <w:rPr>
@@ -4984,7 +4984,7 @@
           <w:p>
             <w:pPr/>
             <w:r>
-              <w:t xml:space="preserve">Every privileged action (push, merge, workflow dispatch, Linear status change, cloud mutation) is recorded in an append-only audit log with session, persona, head SHA and actor</w:t>
+              <w:t xml:space="preserve">Every privileged action the platform executes or forwards (push, merge, workflow dispatch, Linear status change, API calls through the worker proxies, including cloud mutations) is recorded in an append-only audit log with session, persona, head SHA and actor; actions taken with direct credentials or over the tailnet are bounded by credential scope and tailnet ACL instead (ADR-0010, ADR-0011)</w:t>
             </w:r>
           </w:p>
         </w:tc>
@@ -5151,7 +5151,7 @@
           <w:p>
             <w:pPr/>
             <w:r>
-              <w:t xml:space="preserve">Secrets live in an external store (OpenBao / Bitwarden Secrets Manager / Infisical / Vault); the platform resolves them by reference at session start</w:t>
+              <w:t xml:space="preserve">Secrets live in an external store behind a pluggable interface (OSS-3), resolved by reference at session start; OpenBao is the first implementation and the only one that mints dynamic credentials (ID-2); Bitwarden Secrets Manager is supported for static secrets; Vault or Infisical may follow (ADR-0010)</w:t>
             </w:r>
           </w:p>
         </w:tc>
@@ -5256,7 +5256,7 @@
           <w:p>
             <w:pPr/>
             <w:r>
-              <w:t xml:space="preserve">Secrets never appear in argv, files, logs or the timeline; output is scrubbed for known secret values and patterns before storage</w:t>
+              <w:t xml:space="preserve">The platform never passes secrets in argv or writes them to files, logs or the timeline; session output (events, terminal recordings, artifacts) is scrubbed for every known secret value, placeholder and token pattern before it leaves the worker; encoded copies made by guest code are not caught, which is why credentials stay outside the sandbox (ID-2)</w:t>
             </w:r>
           </w:p>
         </w:tc>
@@ -5423,7 +5423,7 @@
           <w:p>
             <w:pPr/>
             <w:r>
-              <w:t xml:space="preserve">Live spend per session from runtime events (tokens x model price), aggregated per issue, persona and day; for subscription runtimes this is a notional API-equivalent figure, and the provider's usage-limit windows are tracked separately</w:t>
+              <w:t xml:space="preserve">Live spend per session (tokens x model price), aggregated per issue, persona and day; API-key sessions are metered at the model gateway outside the sandbox, which is authoritative; subscription sessions use runtime-reported usage, a notional API-equivalent figure, and the provider's usage-limit windows are tracked separately</w:t>
             </w:r>
           </w:p>
         </w:tc>
@@ -5458,7 +5458,7 @@
           <w:p>
             <w:pPr/>
             <w:r>
-              <w:t xml:space="preserve">Hard budget caps per session and per day; at the cap the session pauses and posts to the inbox</w:t>
+              <w:t xml:space="preserve">Hard budget caps per session and per day: API-key sessions are capped at the model gateway outside the sandbox, so spend cannot pass the cap; subscription sessions are capped best effort on their notional spend (COST-1) by the runtime adapter (ADR-0014); at the cap the session pauses and posts to the inbox</w:t>
             </w:r>
           </w:p>
         </w:tc>
@@ -5493,7 +5493,7 @@
           <w:p>
             <w:pPr/>
             <w:r>
-              <w:t xml:space="preserve">Support subscription-auth runtimes (Claude Code OAuth, Codex login) alongside API keys, with per-session isolated auth homes; subscription mode is opt-in and limited to single-subscriber deployments; it places the subscriber's own token in that subscriber's sessions, a permanent exception to ID-2 (ADR-0014)</w:t>
+              <w:t xml:space="preserve">Support subscription-auth runtimes (Claude Code setup-token, ChatGPT sign-in for Codex or opencode) alongside API keys; subscription mode is opt-in and available only when the deployment's single user is both the subscriber and the operator, on infrastructure only they control; multi-user deployments cannot enable it; it places the subscriber's own token in that subscriber's sessions, a permanent exception to ID-2 (ADR-0014)</w:t>
             </w:r>
           </w:p>
         </w:tc>
@@ -6197,18 +6197,18 @@
           <w:p>
             <w:pPr/>
             <w:r>
-              <w:t xml:space="preserve">OpenHands runtime, E2B / microsandbox, Firecracker, gVisor</w:t>
-            </w:r>
-          </w:p>
-        </w:tc>
-        <w:tc>
-          <w:tcPr>
-            <w:tcW w:w="3120" w:type="dxa"/>
-          </w:tcPr>
-          <w:p>
-            <w:pPr/>
-            <w:r>
-              <w:t xml:space="preserve">Adapter to the chosen backend</w:t>
+              <w:t xml:space="preserve">Firecracker (Cloud Hypervisor fallback)</w:t>
+            </w:r>
+          </w:p>
+        </w:tc>
+        <w:tc>
+          <w:tcPr>
+            <w:tcW w:w="3120" w:type="dxa"/>
+          </w:tcPr>
+          <w:p>
+            <w:pPr/>
+            <w:r>
+              <w:t xml:space="preserve">SandboxProvider adapter, image and snapshot pipeline (ADR-0007, ADR-0008)</w:t>
             </w:r>
           </w:p>
         </w:tc>
@@ -6232,7 +6232,7 @@
           <w:p>
             <w:pPr/>
             <w:r>
-              <w:t xml:space="preserve">Coder (Terraform templates), devcontainer spec</w:t>
+              <w:t xml:space="preserve">devcontainer spec as a later import format (ADR-0008); Coder not adopted (ADR-0002)</w:t>
             </w:r>
           </w:p>
         </w:tc>
@@ -6273,18 +6273,18 @@
           <w:p>
             <w:pPr/>
             <w:r>
-              <w:t xml:space="preserve">Claude Code, opencode, Codex CLI headless modes</w:t>
-            </w:r>
-          </w:p>
-        </w:tc>
-        <w:tc>
-          <w:tcPr>
-            <w:tcW w:w="3120" w:type="dxa"/>
-          </w:tcPr>
-          <w:p>
-            <w:pPr/>
-            <w:r>
-              <w:t xml:space="preserve">Runtime adapters + event normalizer (RT-1, RT-2)</w:t>
+              <w:t xml:space="preserve">Claude Code headless; ACP agents (opencode, codex-acp)</w:t>
+            </w:r>
+          </w:p>
+        </w:tc>
+        <w:tc>
+          <w:tcPr>
+            <w:tcW w:w="3120" w:type="dxa"/>
+          </w:tcPr>
+          <w:p>
+            <w:pPr/>
+            <w:r>
+              <w:t xml:space="preserve">Two runtime adapters + event schema (RT-1, RT-2, ADR-0009)</w:t>
             </w:r>
           </w:p>
         </w:tc>
@@ -6308,7 +6308,7 @@
           <w:p>
             <w:pPr/>
             <w:r>
-              <w:t xml:space="preserve">Temporal or a durable-execution library</w:t>
+              <w:t xml:space="preserve">DBOS Transact (Java) on Postgres (ADR-0006)</w:t>
             </w:r>
           </w:p>
         </w:tc>
@@ -6343,18 +6343,18 @@
           <w:p>
             <w:pPr/>
             <w:r>
-              <w:t xml:space="preserve">OpenHands UI, code-server, xterm.js, noVNC for browser view</w:t>
-            </w:r>
-          </w:p>
-        </w:tc>
-        <w:tc>
-          <w:tcPr>
-            <w:tcW w:w="3120" w:type="dxa"/>
-          </w:tcPr>
-          <w:p>
-            <w:pPr/>
-            <w:r>
-              <w:t xml:space="preserve">Session list, inbox, timeline</w:t>
+              <w:t xml:space="preserve">code-server, xterm.js, noVNC for browser view (ADR-0013)</w:t>
+            </w:r>
+          </w:p>
+        </w:tc>
+        <w:tc>
+          <w:tcPr>
+            <w:tcW w:w="3120" w:type="dxa"/>
+          </w:tcPr>
+          <w:p>
+            <w:pPr/>
+            <w:r>
+              <w:t xml:space="preserve">Session list, inbox, timeline (ADR-0016)</w:t>
             </w:r>
           </w:p>
         </w:tc>
@@ -6413,18 +6413,18 @@
           <w:p>
             <w:pPr/>
             <w:r>
-              <w:t xml:space="preserve">Squid / Envoy / smokescreen</w:t>
-            </w:r>
-          </w:p>
-        </w:tc>
-        <w:tc>
-          <w:tcPr>
-            <w:tcW w:w="3120" w:type="dxa"/>
-          </w:tcPr>
-          <w:p>
-            <w:pPr/>
-            <w:r>
-              <w:t xml:space="preserve">Allowlist config from blueprints</w:t>
+              <w:t xml:space="preserve">None adopted: Envoy's SNI proxy is alpha, smokescreen needs explicit proxy settings (ADR-0011)</w:t>
+            </w:r>
+          </w:p>
+        </w:tc>
+        <w:tc>
+          <w:tcPr>
+            <w:tcW w:w="3120" w:type="dxa"/>
+          </w:tcPr>
+          <w:p>
+            <w:pPr/>
+            <w:r>
+              <w:t xml:space="preserve">Rust egress proxy on the worker, allowlist from blueprints (ADR-0011)</w:t>
             </w:r>
           </w:p>
         </w:tc>
@@ -6720,7 +6720,7 @@
         <w:t xml:space="preserve">Phase 0 - Spike (timebox 1 week):</w:t>
       </w:r>
       <w:r>
-        <w:t xml:space="preserve"> compare OpenHands runtime, Coder, E2B/microsandbox and plain Firecracker for SB-1, SEC-1, SEC-2; test broker-held subscription credentials (COST-3, answered in ADR-0014); run one Claude Code session headless end to end. Exit: sandbox backend chosen, ADR merged.</w:t>
+        <w:t xml:space="preserve"> compare OpenHands runtime, Coder, E2B/microsandbox and plain Firecracker for SB-1, SEC-1 and the network-level part of SEC-2 (default deny; the proxy domain allowlist is checked in the first Phase 1 slice); verify the subscription-token auth signals (COST-3, architecture test 6a; the broker-held credential question is answered in ADR-0014); run one Claude Code session headless end to end. Exit: sandbox backend chosen, ADR merged.</w:t>
       </w:r>
     </w:p>
     <w:p>
@@ -6812,7 +6812,7 @@
         </w:numPr>
       </w:pPr>
       <w:r>
-        <w:t xml:space="preserve">☐ Build on OpenHands' runtime and UI, or a thin new control plane over Coder/Firecracker? Decide in Phase 0.</w:t>
+        <w:t xml:space="preserve">☒ Build on OpenHands' runtime and UI, or a thin new control plane over Coder/Firecracker? Resolved: a thin new control plane that reuses components at defined seams (ADR-0002); Phase 0 still measures OpenHands, Coder, E2B and microsandbox as evidence.</w:t>
       </w:r>
     </w:p>
     <w:p>
@@ -6824,7 +6824,19 @@
         </w:numPr>
       </w:pPr>
       <w:r>
-        <w:t xml:space="preserve">☐ Do Claude Code and Codex subscription terms allow headless use from a self-hosted multi-session server, or are API keys required? (COST-3) Answered in ADR-0014: API keys by default; subscription mode only for single-subscriber deployments, with storing the Claude setup-token an accepted residual risk awaiting owner sign-off.</w:t>
+        <w:t xml:space="preserve">☒ Do Claude Code and Codex subscription terms allow headless use from a self-hosted multi-session server, or are API keys required? (COST-3) Resolved in ADR-0014: API keys by default; subscription mode is opt-in for a single-user deployment whose user is both the subscriber and the operator.</w:t>
+      </w:r>
+    </w:p>
+    <w:p>
+      <w:pPr>
+        <w:pStyle w:val="ListParagraph"/>
+        <w:numPr>
+          <w:ilvl w:val="0"/>
+          <w:numId w:val="9"/>
+        </w:numPr>
+      </w:pPr>
+      <w:r>
+        <w:t xml:space="preserve">☐ Project owner sign-off on the residual terms risk of storing the subscriber's Claude setup-token, required before subscription mode ships (ADR-0014).</w:t>
       </w:r>
     </w:p>
     <w:p>

</xml_diff>

<commit_message>
docs: tidy round-3 review nits in requirements
Cite ADR-0010/ADR-0015 for GH-6 and ID-4, say plain containers in SEC-1,
lead COST-2 with which caps are hard, and note in ID-2 that only
credentials with no injectable header enter the sandbox.

Exported from the live doc at rev 79.
</commit_message>
<xml_diff>
--- a/docs/requirements.docx
+++ b/docs/requirements.docx
@@ -3653,7 +3653,7 @@
           <w:p>
             <w:pPr/>
             <w:r>
-              <w:t xml:space="preserve">Users link their GitHub account through the app's user authorization (OAuth); the server keeps the refresh token in the secret store, and short-lived user access tokens are applied only at the worker, never inside the sandbox (ID-2); user tokens cannot be narrowed to the persona's permissions, so every use passes the persona's policy check (SEC-5); tokens are requested restricted to the session's target repo (GitHub's repository_id parameter) where GitHub allows it, as defense in depth only (ADR-0012)</w:t>
+              <w:t xml:space="preserve">Users link their GitHub account through the app's user authorization (OAuth); the server keeps the refresh token in the secret store, and short-lived user access tokens are applied only at the worker, never inside the sandbox (ADR-0010); user tokens cannot be narrowed to the persona's permissions, so every use passes the persona's policy check (ADR-0015) and is audited (SEC-5); tokens are requested restricted to the session's target repo (GitHub's repository_id parameter) where GitHub allows it, as defense in depth only (ADR-0012)</w:t>
             </w:r>
           </w:p>
         </w:tc>
@@ -4835,7 +4835,7 @@
           <w:p>
             <w:pPr/>
             <w:r>
-              <w:t xml:space="preserve">Sandboxes get a VM-grade boundary: a hardware-virtualized microVM such as Firecracker or Cloud Hypervisor; containers and userspace kernels such as gVisor do not qualify; no host Docker socket, no </w:t>
+              <w:t xml:space="preserve">Sandboxes get a VM-grade boundary: a hardware-virtualized microVM such as Firecracker or Cloud Hypervisor; plain containers and userspace kernels such as gVisor do not qualify; no host Docker socket, no </w:t>
             </w:r>
             <w:r>
               <w:rPr>
@@ -5186,7 +5186,7 @@
           <w:p>
             <w:pPr/>
             <w:r>
-              <w:t xml:space="preserve">Credentials are minted per session and short-lived: GitHub App installation tokens scoped to the session's repos, Linear and cloud tokens via broker; nothing long-lived enters the sandbox</w:t>
+              <w:t xml:space="preserve">Credentials are minted per session and short-lived: GitHub App installation tokens scoped to the session's repos, Linear and cloud tokens via broker; nothing long-lived enters the sandbox, and in practice only credentials with no injectable header enter it at all (ADR-0010)</w:t>
             </w:r>
           </w:p>
         </w:tc>
@@ -5256,7 +5256,7 @@
           <w:p>
             <w:pPr/>
             <w:r>
-              <w:t xml:space="preserve">The platform never passes secrets in argv or writes them to files, logs or the timeline; session output (events, terminal recordings, artifacts) is scrubbed for every known secret value, placeholder and token pattern before it leaves the worker; encoded copies made by guest code are not caught, which is why credentials stay outside the sandbox (ID-2)</w:t>
+              <w:t xml:space="preserve">The platform never passes secrets in argv or writes them to files, logs or the timeline; session output (events, terminal recordings, artifacts) is scrubbed for every known secret value, placeholder and token pattern before it leaves the worker; encoded copies made by guest code are not caught, which is why credentials stay outside the sandbox (ADR-0010)</w:t>
             </w:r>
           </w:p>
         </w:tc>
@@ -5458,7 +5458,7 @@
           <w:p>
             <w:pPr/>
             <w:r>
-              <w:t xml:space="preserve">Hard budget caps per session and per day: API-key sessions are capped at the model gateway outside the sandbox, so spend cannot pass the cap except by provider-side usage a response does not report, which is reconciled on the next request; subscription sessions are capped best effort on their notional spend (COST-1) by the runtime adapter (ADR-0014); at the cap the session pauses and posts to the inbox</w:t>
+              <w:t xml:space="preserve">Budget caps per session and per day, hard for API-key sessions: they are capped at the model gateway outside the sandbox, so spend cannot pass the cap except by provider-side usage a response does not report, which is reconciled on the next request; subscription sessions are capped best effort on their notional spend (COST-1) by the runtime adapter (ADR-0014); at the cap the session pauses and posts to the inbox</w:t>
             </w:r>
           </w:p>
         </w:tc>

</xml_diff>

<commit_message>
ADR-0012: sign commits in the guest through a forwarded SSH agent
Replace push-time commit recreation and the staging branch with a
per-session SSH signing key held by the worker and reached through the
session's agent socket. Bot-mode commits come from a deployment machine
user; GH-7 and GH-8 are updated to match.
</commit_message>
<xml_diff>
--- a/docs/requirements.docx
+++ b/docs/requirements.docx
@@ -3688,7 +3688,7 @@
           <w:p>
             <w:pPr/>
             <w:r>
-              <w:t xml:space="preserve">Per persona or session, PRs, commits and comments are authored as the app bot (default) or as the linked user; reviewer personas always post as the bot</w:t>
+              <w:t xml:space="preserve">Per persona or session, PRs and comments are authored as the app bot (default) or as the linked user, and commits as the deployment's machine user (default) or as the linked user; reviewer personas always post as the bot</w:t>
             </w:r>
           </w:p>
         </w:tc>
@@ -3723,7 +3723,7 @@
           <w:p>
             <w:pPr/>
             <w:r>
-              <w:t xml:space="preserve">In user-authored mode, commits are signed with a key registered to that user's GitHub account so they show as Verified; otherwise the bot stays committer and the user is credited as co-author (SEC-7)</w:t>
+              <w:t xml:space="preserve">In user-authored mode, commits are signed with a key registered to that user's GitHub account so they show as Verified; otherwise the deployment's machine user stays committer and the user is credited as co-author (SEC-7)</w:t>
             </w:r>
           </w:p>
         </w:tc>

</xml_diff>